<commit_message>
agrego evidencia y documentos de pruebas
</commit_message>
<xml_diff>
--- a/docs/Entrega_Ciclo_de_Solicitud.docx
+++ b/docs/Entrega_Ciclo_de_Solicitud.docx
@@ -12,7 +12,7 @@
     </w:p>
     <w:p>
       <w:pPr>
-        <w:spacing w:after="120"/>
+        <w:spacing w:after="80"/>
       </w:pPr>
       <w:r>
         <w:t>Documentación técnica de una API de gestión de incidencias. El proyecto preserva datos al evolucionar su base PostgreSQL mediante migraciones versionadas.</w:t>
@@ -28,7 +28,7 @@
     </w:p>
     <w:p>
       <w:pPr>
-        <w:spacing w:after="120"/>
+        <w:spacing w:after="80"/>
       </w:pPr>
       <w:r>
         <w:t>Construir una API REST para crear y consultar incidencias y categorías, con validación, documentación Swagger, persistencia con Prisma y PostgreSQL. La entrega demuestra cómo evolucionar una relación obligatoria sin perder los datos que existían antes del cambio.</w:t>
@@ -50,13 +50,16 @@
         <w:tblLook w:firstColumn="1" w:firstRow="1" w:lastColumn="0" w:lastRow="0" w:noHBand="0" w:noVBand="1" w:val="04A0"/>
       </w:tblPr>
       <w:tblGrid>
-        <w:gridCol w:w="4968"/>
-        <w:gridCol w:w="4968"/>
+        <w:gridCol w:w="5112"/>
+        <w:gridCol w:w="5112"/>
       </w:tblGrid>
       <w:tr>
+        <w:trPr>
+          <w:tblHeader w:val="true"/>
+        </w:trPr>
         <w:tc>
           <w:tcPr>
-            <w:tcW w:type="dxa" w:w="4968"/>
+            <w:tcW w:type="dxa" w:w="5112"/>
             <w:shd w:fill="1F4E78"/>
           </w:tcPr>
           <w:p>
@@ -71,7 +74,7 @@
         </w:tc>
         <w:tc>
           <w:tcPr>
-            <w:tcW w:type="dxa" w:w="4968"/>
+            <w:tcW w:type="dxa" w:w="5112"/>
             <w:shd w:fill="1F4E78"/>
           </w:tcPr>
           <w:p>
@@ -86,9 +89,12 @@
         </w:tc>
       </w:tr>
       <w:tr>
+        <w:trPr>
+          <w:cantSplit/>
+        </w:trPr>
         <w:tc>
           <w:tcPr>
-            <w:tcW w:type="dxa" w:w="4968"/>
+            <w:tcW w:type="dxa" w:w="5112"/>
             <w:vAlign w:val="center"/>
           </w:tcPr>
           <w:p>
@@ -99,7 +105,7 @@
         </w:tc>
         <w:tc>
           <w:tcPr>
-            <w:tcW w:type="dxa" w:w="4968"/>
+            <w:tcW w:type="dxa" w:w="5112"/>
             <w:vAlign w:val="center"/>
           </w:tcPr>
           <w:p>
@@ -110,9 +116,12 @@
         </w:tc>
       </w:tr>
       <w:tr>
+        <w:trPr>
+          <w:cantSplit/>
+        </w:trPr>
         <w:tc>
           <w:tcPr>
-            <w:tcW w:type="dxa" w:w="4968"/>
+            <w:tcW w:type="dxa" w:w="5112"/>
             <w:vAlign w:val="center"/>
           </w:tcPr>
           <w:p>
@@ -123,7 +132,7 @@
         </w:tc>
         <w:tc>
           <w:tcPr>
-            <w:tcW w:type="dxa" w:w="4968"/>
+            <w:tcW w:type="dxa" w:w="5112"/>
             <w:vAlign w:val="center"/>
           </w:tcPr>
           <w:p>
@@ -134,9 +143,12 @@
         </w:tc>
       </w:tr>
       <w:tr>
+        <w:trPr>
+          <w:cantSplit/>
+        </w:trPr>
         <w:tc>
           <w:tcPr>
-            <w:tcW w:type="dxa" w:w="4968"/>
+            <w:tcW w:type="dxa" w:w="5112"/>
             <w:vAlign w:val="center"/>
           </w:tcPr>
           <w:p>
@@ -147,7 +159,7 @@
         </w:tc>
         <w:tc>
           <w:tcPr>
-            <w:tcW w:type="dxa" w:w="4968"/>
+            <w:tcW w:type="dxa" w:w="5112"/>
             <w:vAlign w:val="center"/>
           </w:tcPr>
           <w:p>
@@ -158,9 +170,12 @@
         </w:tc>
       </w:tr>
       <w:tr>
+        <w:trPr>
+          <w:cantSplit/>
+        </w:trPr>
         <w:tc>
           <w:tcPr>
-            <w:tcW w:type="dxa" w:w="4968"/>
+            <w:tcW w:type="dxa" w:w="5112"/>
             <w:vAlign w:val="center"/>
           </w:tcPr>
           <w:p>
@@ -171,7 +186,7 @@
         </w:tc>
         <w:tc>
           <w:tcPr>
-            <w:tcW w:type="dxa" w:w="4968"/>
+            <w:tcW w:type="dxa" w:w="5112"/>
             <w:vAlign w:val="center"/>
           </w:tcPr>
           <w:p>
@@ -182,9 +197,12 @@
         </w:tc>
       </w:tr>
       <w:tr>
+        <w:trPr>
+          <w:cantSplit/>
+        </w:trPr>
         <w:tc>
           <w:tcPr>
-            <w:tcW w:type="dxa" w:w="4968"/>
+            <w:tcW w:type="dxa" w:w="5112"/>
             <w:vAlign w:val="center"/>
           </w:tcPr>
           <w:p>
@@ -195,7 +213,7 @@
         </w:tc>
         <w:tc>
           <w:tcPr>
-            <w:tcW w:type="dxa" w:w="4968"/>
+            <w:tcW w:type="dxa" w:w="5112"/>
             <w:vAlign w:val="center"/>
           </w:tcPr>
           <w:p>
@@ -206,9 +224,12 @@
         </w:tc>
       </w:tr>
       <w:tr>
+        <w:trPr>
+          <w:cantSplit/>
+        </w:trPr>
         <w:tc>
           <w:tcPr>
-            <w:tcW w:type="dxa" w:w="4968"/>
+            <w:tcW w:type="dxa" w:w="5112"/>
             <w:vAlign w:val="center"/>
           </w:tcPr>
           <w:p>
@@ -219,7 +240,7 @@
         </w:tc>
         <w:tc>
           <w:tcPr>
-            <w:tcW w:type="dxa" w:w="4968"/>
+            <w:tcW w:type="dxa" w:w="5112"/>
             <w:vAlign w:val="center"/>
           </w:tcPr>
           <w:p>
@@ -241,7 +262,7 @@
     </w:p>
     <w:p>
       <w:pPr>
-        <w:spacing w:after="120"/>
+        <w:spacing w:after="80"/>
       </w:pPr>
       <w:r>
         <w:t>El controller no concentra reglas de negocio: recibe HTTP y delega. El service verifica que la categoría exista; el repository contiene las consultas Prisma.</w:t>
@@ -267,7 +288,7 @@
     </w:p>
     <w:p>
       <w:pPr>
-        <w:spacing w:after="120"/>
+        <w:spacing w:after="80"/>
       </w:pPr>
       <w:r>
         <w:t>El DTO controla los campos, tipos y estados permitidos. Los errores de validación son 400; recursos inexistentes son 404; una violación de unicidad de Prisma se transforma en 409; los demás errores Prisma se responden como 500.</w:t>
@@ -289,13 +310,16 @@
         <w:tblLook w:firstColumn="1" w:firstRow="1" w:lastColumn="0" w:lastRow="0" w:noHBand="0" w:noVBand="1" w:val="04A0"/>
       </w:tblPr>
       <w:tblGrid>
-        <w:gridCol w:w="4968"/>
-        <w:gridCol w:w="4968"/>
+        <w:gridCol w:w="5112"/>
+        <w:gridCol w:w="5112"/>
       </w:tblGrid>
       <w:tr>
+        <w:trPr>
+          <w:tblHeader w:val="true"/>
+        </w:trPr>
         <w:tc>
           <w:tcPr>
-            <w:tcW w:type="dxa" w:w="4968"/>
+            <w:tcW w:type="dxa" w:w="5112"/>
             <w:shd w:fill="1F4E78"/>
           </w:tcPr>
           <w:p>
@@ -310,7 +334,7 @@
         </w:tc>
         <w:tc>
           <w:tcPr>
-            <w:tcW w:type="dxa" w:w="4968"/>
+            <w:tcW w:type="dxa" w:w="5112"/>
             <w:shd w:fill="1F4E78"/>
           </w:tcPr>
           <w:p>
@@ -325,9 +349,12 @@
         </w:tc>
       </w:tr>
       <w:tr>
+        <w:trPr>
+          <w:cantSplit/>
+        </w:trPr>
         <w:tc>
           <w:tcPr>
-            <w:tcW w:type="dxa" w:w="4968"/>
+            <w:tcW w:type="dxa" w:w="5112"/>
             <w:vAlign w:val="center"/>
           </w:tcPr>
           <w:p>
@@ -338,7 +365,7 @@
         </w:tc>
         <w:tc>
           <w:tcPr>
-            <w:tcW w:type="dxa" w:w="4968"/>
+            <w:tcW w:type="dxa" w:w="5112"/>
             <w:vAlign w:val="center"/>
           </w:tcPr>
           <w:p>
@@ -349,9 +376,12 @@
         </w:tc>
       </w:tr>
       <w:tr>
+        <w:trPr>
+          <w:cantSplit/>
+        </w:trPr>
         <w:tc>
           <w:tcPr>
-            <w:tcW w:type="dxa" w:w="4968"/>
+            <w:tcW w:type="dxa" w:w="5112"/>
             <w:vAlign w:val="center"/>
           </w:tcPr>
           <w:p>
@@ -362,7 +392,7 @@
         </w:tc>
         <w:tc>
           <w:tcPr>
-            <w:tcW w:type="dxa" w:w="4968"/>
+            <w:tcW w:type="dxa" w:w="5112"/>
             <w:vAlign w:val="center"/>
           </w:tcPr>
           <w:p>
@@ -385,7 +415,7 @@
     </w:p>
     <w:p>
       <w:pPr>
-        <w:spacing w:after="120"/>
+        <w:spacing w:after="80"/>
       </w:pPr>
       <w:r>
         <w:t>categoryId es obligatorio al finalizar la evolución y tiene una clave foránea hacia Category.id.</w:t>
@@ -407,14 +437,17 @@
         <w:tblLook w:firstColumn="1" w:firstRow="1" w:lastColumn="0" w:lastRow="0" w:noHBand="0" w:noVBand="1" w:val="04A0"/>
       </w:tblPr>
       <w:tblGrid>
-        <w:gridCol w:w="3312"/>
-        <w:gridCol w:w="3312"/>
-        <w:gridCol w:w="3312"/>
+        <w:gridCol w:w="3408"/>
+        <w:gridCol w:w="3408"/>
+        <w:gridCol w:w="3408"/>
       </w:tblGrid>
       <w:tr>
+        <w:trPr>
+          <w:tblHeader w:val="true"/>
+        </w:trPr>
         <w:tc>
           <w:tcPr>
-            <w:tcW w:type="dxa" w:w="3312"/>
+            <w:tcW w:type="dxa" w:w="3408"/>
             <w:shd w:fill="1F4E78"/>
           </w:tcPr>
           <w:p>
@@ -429,7 +462,7 @@
         </w:tc>
         <w:tc>
           <w:tcPr>
-            <w:tcW w:type="dxa" w:w="3312"/>
+            <w:tcW w:type="dxa" w:w="3408"/>
             <w:shd w:fill="1F4E78"/>
           </w:tcPr>
           <w:p>
@@ -444,7 +477,7 @@
         </w:tc>
         <w:tc>
           <w:tcPr>
-            <w:tcW w:type="dxa" w:w="3312"/>
+            <w:tcW w:type="dxa" w:w="3408"/>
             <w:shd w:fill="1F4E78"/>
           </w:tcPr>
           <w:p>
@@ -459,9 +492,12 @@
         </w:tc>
       </w:tr>
       <w:tr>
+        <w:trPr>
+          <w:cantSplit/>
+        </w:trPr>
         <w:tc>
           <w:tcPr>
-            <w:tcW w:type="dxa" w:w="3312"/>
+            <w:tcW w:type="dxa" w:w="3408"/>
             <w:vAlign w:val="center"/>
           </w:tcPr>
           <w:p>
@@ -472,7 +508,7 @@
         </w:tc>
         <w:tc>
           <w:tcPr>
-            <w:tcW w:type="dxa" w:w="3312"/>
+            <w:tcW w:type="dxa" w:w="3408"/>
             <w:vAlign w:val="center"/>
           </w:tcPr>
           <w:p>
@@ -483,7 +519,7 @@
         </w:tc>
         <w:tc>
           <w:tcPr>
-            <w:tcW w:type="dxa" w:w="3312"/>
+            <w:tcW w:type="dxa" w:w="3408"/>
             <w:vAlign w:val="center"/>
           </w:tcPr>
           <w:p>
@@ -494,9 +530,12 @@
         </w:tc>
       </w:tr>
       <w:tr>
+        <w:trPr>
+          <w:cantSplit/>
+        </w:trPr>
         <w:tc>
           <w:tcPr>
-            <w:tcW w:type="dxa" w:w="3312"/>
+            <w:tcW w:type="dxa" w:w="3408"/>
             <w:vAlign w:val="center"/>
           </w:tcPr>
           <w:p>
@@ -507,7 +546,7 @@
         </w:tc>
         <w:tc>
           <w:tcPr>
-            <w:tcW w:type="dxa" w:w="3312"/>
+            <w:tcW w:type="dxa" w:w="3408"/>
             <w:vAlign w:val="center"/>
           </w:tcPr>
           <w:p>
@@ -518,7 +557,7 @@
         </w:tc>
         <w:tc>
           <w:tcPr>
-            <w:tcW w:type="dxa" w:w="3312"/>
+            <w:tcW w:type="dxa" w:w="3408"/>
             <w:vAlign w:val="center"/>
           </w:tcPr>
           <w:p>
@@ -529,9 +568,12 @@
         </w:tc>
       </w:tr>
       <w:tr>
+        <w:trPr>
+          <w:cantSplit/>
+        </w:trPr>
         <w:tc>
           <w:tcPr>
-            <w:tcW w:type="dxa" w:w="3312"/>
+            <w:tcW w:type="dxa" w:w="3408"/>
             <w:vAlign w:val="center"/>
           </w:tcPr>
           <w:p>
@@ -542,7 +584,7 @@
         </w:tc>
         <w:tc>
           <w:tcPr>
-            <w:tcW w:type="dxa" w:w="3312"/>
+            <w:tcW w:type="dxa" w:w="3408"/>
             <w:vAlign w:val="center"/>
           </w:tcPr>
           <w:p>
@@ -553,7 +595,7 @@
         </w:tc>
         <w:tc>
           <w:tcPr>
-            <w:tcW w:type="dxa" w:w="3312"/>
+            <w:tcW w:type="dxa" w:w="3408"/>
             <w:vAlign w:val="center"/>
           </w:tcPr>
           <w:p>
@@ -564,9 +606,12 @@
         </w:tc>
       </w:tr>
       <w:tr>
+        <w:trPr>
+          <w:cantSplit/>
+        </w:trPr>
         <w:tc>
           <w:tcPr>
-            <w:tcW w:type="dxa" w:w="3312"/>
+            <w:tcW w:type="dxa" w:w="3408"/>
             <w:vAlign w:val="center"/>
           </w:tcPr>
           <w:p>
@@ -577,7 +622,7 @@
         </w:tc>
         <w:tc>
           <w:tcPr>
-            <w:tcW w:type="dxa" w:w="3312"/>
+            <w:tcW w:type="dxa" w:w="3408"/>
             <w:vAlign w:val="center"/>
           </w:tcPr>
           <w:p>
@@ -588,7 +633,7 @@
         </w:tc>
         <w:tc>
           <w:tcPr>
-            <w:tcW w:type="dxa" w:w="3312"/>
+            <w:tcW w:type="dxa" w:w="3408"/>
             <w:vAlign w:val="center"/>
           </w:tcPr>
           <w:p>
@@ -602,7 +647,7 @@
     <w:p/>
     <w:p>
       <w:pPr>
-        <w:spacing w:after="120"/>
+        <w:spacing w:after="80"/>
       </w:pPr>
       <w:r>
         <w:t>La secuencia expandir -&gt; migrar datos -&gt; contraer evita una alteración incompatible sobre filas existentes. Las migraciones anteriores permanecen intactas después de aplicarse.</w:t>
@@ -618,7 +663,7 @@
     </w:p>
     <w:p>
       <w:pPr>
-        <w:spacing w:after="120"/>
+        <w:spacing w:after="80"/>
       </w:pPr>
       <w:r>
         <w:t>El seed usa upsert para GENERAL y SOFTWARE. La incidencia de ejemplo se busca y actualiza si existe, por lo que npm run seed se puede repetir sin duplicar información.</w:t>
@@ -626,7 +671,7 @@
     </w:p>
     <w:p>
       <w:pPr>
-        <w:spacing w:after="120"/>
+        <w:spacing w:after="80"/>
       </w:pPr>
       <w:r>
         <w:t>PostgreSQL impone Category.code UNIQUE. Crear dos categorías con el mismo code produce el error P2002 de Prisma, que el filtro de excepciones expone como HTTP 409.</w:t>
@@ -648,14 +693,17 @@
         <w:tblLook w:firstColumn="1" w:firstRow="1" w:lastColumn="0" w:lastRow="0" w:noHBand="0" w:noVBand="1" w:val="04A0"/>
       </w:tblPr>
       <w:tblGrid>
-        <w:gridCol w:w="3312"/>
-        <w:gridCol w:w="3312"/>
-        <w:gridCol w:w="3312"/>
+        <w:gridCol w:w="3408"/>
+        <w:gridCol w:w="3408"/>
+        <w:gridCol w:w="3408"/>
       </w:tblGrid>
       <w:tr>
+        <w:trPr>
+          <w:tblHeader w:val="true"/>
+        </w:trPr>
         <w:tc>
           <w:tcPr>
-            <w:tcW w:type="dxa" w:w="3312"/>
+            <w:tcW w:type="dxa" w:w="3408"/>
             <w:shd w:fill="1F4E78"/>
           </w:tcPr>
           <w:p>
@@ -670,7 +718,7 @@
         </w:tc>
         <w:tc>
           <w:tcPr>
-            <w:tcW w:type="dxa" w:w="3312"/>
+            <w:tcW w:type="dxa" w:w="3408"/>
             <w:shd w:fill="1F4E78"/>
           </w:tcPr>
           <w:p>
@@ -685,7 +733,7 @@
         </w:tc>
         <w:tc>
           <w:tcPr>
-            <w:tcW w:type="dxa" w:w="3312"/>
+            <w:tcW w:type="dxa" w:w="3408"/>
             <w:shd w:fill="1F4E78"/>
           </w:tcPr>
           <w:p>
@@ -700,9 +748,12 @@
         </w:tc>
       </w:tr>
       <w:tr>
+        <w:trPr>
+          <w:cantSplit/>
+        </w:trPr>
         <w:tc>
           <w:tcPr>
-            <w:tcW w:type="dxa" w:w="3312"/>
+            <w:tcW w:type="dxa" w:w="3408"/>
             <w:vAlign w:val="center"/>
           </w:tcPr>
           <w:p>
@@ -713,7 +764,7 @@
         </w:tc>
         <w:tc>
           <w:tcPr>
-            <w:tcW w:type="dxa" w:w="3312"/>
+            <w:tcW w:type="dxa" w:w="3408"/>
             <w:vAlign w:val="center"/>
           </w:tcPr>
           <w:p>
@@ -724,7 +775,7 @@
         </w:tc>
         <w:tc>
           <w:tcPr>
-            <w:tcW w:type="dxa" w:w="3312"/>
+            <w:tcW w:type="dxa" w:w="3408"/>
             <w:vAlign w:val="center"/>
           </w:tcPr>
           <w:p>
@@ -735,9 +786,12 @@
         </w:tc>
       </w:tr>
       <w:tr>
+        <w:trPr>
+          <w:cantSplit/>
+        </w:trPr>
         <w:tc>
           <w:tcPr>
-            <w:tcW w:type="dxa" w:w="3312"/>
+            <w:tcW w:type="dxa" w:w="3408"/>
             <w:vAlign w:val="center"/>
           </w:tcPr>
           <w:p>
@@ -748,7 +802,7 @@
         </w:tc>
         <w:tc>
           <w:tcPr>
-            <w:tcW w:type="dxa" w:w="3312"/>
+            <w:tcW w:type="dxa" w:w="3408"/>
             <w:vAlign w:val="center"/>
           </w:tcPr>
           <w:p>
@@ -759,7 +813,7 @@
         </w:tc>
         <w:tc>
           <w:tcPr>
-            <w:tcW w:type="dxa" w:w="3312"/>
+            <w:tcW w:type="dxa" w:w="3408"/>
             <w:vAlign w:val="center"/>
           </w:tcPr>
           <w:p>
@@ -770,9 +824,12 @@
         </w:tc>
       </w:tr>
       <w:tr>
+        <w:trPr>
+          <w:cantSplit/>
+        </w:trPr>
         <w:tc>
           <w:tcPr>
-            <w:tcW w:type="dxa" w:w="3312"/>
+            <w:tcW w:type="dxa" w:w="3408"/>
             <w:vAlign w:val="center"/>
           </w:tcPr>
           <w:p>
@@ -783,7 +840,7 @@
         </w:tc>
         <w:tc>
           <w:tcPr>
-            <w:tcW w:type="dxa" w:w="3312"/>
+            <w:tcW w:type="dxa" w:w="3408"/>
             <w:vAlign w:val="center"/>
           </w:tcPr>
           <w:p>
@@ -794,7 +851,7 @@
         </w:tc>
         <w:tc>
           <w:tcPr>
-            <w:tcW w:type="dxa" w:w="3312"/>
+            <w:tcW w:type="dxa" w:w="3408"/>
             <w:vAlign w:val="center"/>
           </w:tcPr>
           <w:p>
@@ -805,9 +862,12 @@
         </w:tc>
       </w:tr>
       <w:tr>
+        <w:trPr>
+          <w:cantSplit/>
+        </w:trPr>
         <w:tc>
           <w:tcPr>
-            <w:tcW w:type="dxa" w:w="3312"/>
+            <w:tcW w:type="dxa" w:w="3408"/>
             <w:vAlign w:val="center"/>
           </w:tcPr>
           <w:p>
@@ -818,7 +878,7 @@
         </w:tc>
         <w:tc>
           <w:tcPr>
-            <w:tcW w:type="dxa" w:w="3312"/>
+            <w:tcW w:type="dxa" w:w="3408"/>
             <w:vAlign w:val="center"/>
           </w:tcPr>
           <w:p>
@@ -829,7 +889,7 @@
         </w:tc>
         <w:tc>
           <w:tcPr>
-            <w:tcW w:type="dxa" w:w="3312"/>
+            <w:tcW w:type="dxa" w:w="3408"/>
             <w:vAlign w:val="center"/>
           </w:tcPr>
           <w:p>
@@ -840,9 +900,12 @@
         </w:tc>
       </w:tr>
       <w:tr>
+        <w:trPr>
+          <w:cantSplit/>
+        </w:trPr>
         <w:tc>
           <w:tcPr>
-            <w:tcW w:type="dxa" w:w="3312"/>
+            <w:tcW w:type="dxa" w:w="3408"/>
             <w:vAlign w:val="center"/>
           </w:tcPr>
           <w:p>
@@ -853,7 +916,7 @@
         </w:tc>
         <w:tc>
           <w:tcPr>
-            <w:tcW w:type="dxa" w:w="3312"/>
+            <w:tcW w:type="dxa" w:w="3408"/>
             <w:vAlign w:val="center"/>
           </w:tcPr>
           <w:p>
@@ -864,7 +927,7 @@
         </w:tc>
         <w:tc>
           <w:tcPr>
-            <w:tcW w:type="dxa" w:w="3312"/>
+            <w:tcW w:type="dxa" w:w="3408"/>
             <w:vAlign w:val="center"/>
           </w:tcPr>
           <w:p>
@@ -878,7 +941,7 @@
     <w:p/>
     <w:p>
       <w:pPr>
-        <w:spacing w:after="120"/>
+        <w:spacing w:after="80"/>
       </w:pPr>
       <w:r>
         <w:t>La UI de Swagger se publica en /api cuando la aplicación está en ejecución.</w:t>
@@ -894,18 +957,26 @@
     </w:p>
     <w:p>
       <w:pPr>
-        <w:spacing w:after="120"/>
+        <w:spacing w:after="80"/>
       </w:pPr>
       <w:r>
-        <w:t>Evidencia obtenida en esta entrega: npm run prisma:generate completó correctamente y npm run build completó correctamente después de crear los módulos, DTOs, filtro y repositorios.</w:t>
+        <w:t>Pruebas reales ejecutadas el 8 de septiembre de 2026: Swagger OpenAPI respondió 200; una solicitud válida respondió 201; DTO inválidos respondieron 400; recursos inexistentes respondieron 404; y un código de categoría repetido respondió 409. npm run build también terminó correctamente.</w:t>
       </w:r>
     </w:p>
     <w:p>
       <w:pPr>
-        <w:spacing w:after="120"/>
+        <w:spacing w:after="80"/>
       </w:pPr>
       <w:r>
-        <w:t>La reconstrucción prevista desde cero es: docker compose down -v; docker compose up -d; npx prisma migrate deploy; npm run seed. Durante la entrega el proceso de Docker Desktop quedó iniciado, pero su API Linux no estuvo disponible; por integridad, no se registra como prueba ejecutada. El archivo de evidencia se actualizará al ejecutar esos comandos con el motor disponible.</w:t>
+        <w:t>La restricción UNIQUE se comprobó creando HTTP_UNIQUE y repitiendo el POST: PostgreSQL rechazó el segundo intento y el filtro Prisma devolvió HTTP 409. La clave foránea se comprobó con una inserción SQL de categoryId 999999: PostgreSQL rechazó la fila por Incident_categoryId_fkey y no dejó registros inválidos.</w:t>
+      </w:r>
+    </w:p>
+    <w:p>
+      <w:pPr>
+        <w:spacing w:after="80"/>
+      </w:pPr>
+      <w:r>
+        <w:t>La reconstrucción desde cero fue ejecutada con docker compose down -v; docker compose up -d; npx prisma migrate deploy; npm run seed. Prisma aplicó las cuatro migraciones y el estado final quedó actualizado. El seed se ejecutó dos veces: quedaron GENERAL y SOFTWARE una sola vez, la incidencia de ejemplo una sola vez, y las dos incidencias históricas quedaron asociadas a GENERAL.</w:t>
       </w:r>
     </w:p>
     <w:p>
@@ -918,7 +989,7 @@
     </w:p>
     <w:p>
       <w:pPr>
-        <w:spacing w:after="120"/>
+        <w:spacing w:after="80"/>
       </w:pPr>
       <w:r>
         <w:t>prisma migrate dev es para desarrollo: genera migraciones desde cambios del esquema. prisma migrate deploy no crea ni modifica migraciones; únicamente aplica las versionadas. Por esa razón se usa para despliegue y reconstrucción.</w:t>
@@ -934,7 +1005,7 @@
     </w:p>
     <w:p>
       <w:pPr>
-        <w:spacing w:after="120"/>
+        <w:spacing w:after="80"/>
       </w:pPr>
       <w:r>
         <w:t>https://github.com/jefroMMM/Ciclo-de-solicitud</w:t>
@@ -942,7 +1013,7 @@
     </w:p>
     <w:sectPr>
       <w:pgSz w:w="12240" w:h="15840"/>
-      <w:pgMar w:top="1008" w:right="1152" w:bottom="1008" w:left="1152" w:header="720" w:footer="720" w:gutter="0"/>
+      <w:pgMar w:top="792" w:right="1008" w:bottom="792" w:left="1008" w:header="720" w:footer="720" w:gutter="0"/>
       <w:cols w:space="720"/>
       <w:docGrid w:linePitch="360"/>
     </w:sectPr>
@@ -1315,7 +1386,7 @@
     <w:rsid w:val="00FC693F"/>
     <w:rPr>
       <w:rFonts w:ascii="Aptos" w:hAnsi="Aptos"/>
-      <w:sz w:val="20"/>
+      <w:sz w:val="18"/>
     </w:rPr>
   </w:style>
   <w:style w:type="paragraph" w:styleId="Header">
@@ -1659,9 +1730,6 @@
     <w:qFormat/>
     <w:rsid w:val="00FC693F"/>
     <w:pPr>
-      <w:pBdr>
-        <w:bottom w:val="single" w:sz="8" w:space="4" w:color="4F81BD" w:themeColor="accent1"/>
-      </w:pBdr>
       <w:spacing w:after="300" w:line="240" w:lineRule="auto"/>
       <w:contextualSpacing/>
     </w:pPr>
@@ -1670,7 +1738,7 @@
       <w:color w:val="000000"/>
       <w:spacing w:val="5"/>
       <w:kern w:val="28"/>
-      <w:sz w:val="44"/>
+      <w:sz w:val="40"/>
       <w:szCs w:val="52"/>
     </w:rPr>
   </w:style>

</xml_diff>